<commit_message>
Update 4- Add light sources to your scene.docx
</commit_message>
<xml_diff>
--- a/Unit 10 - Lighting/4- Add light sources to your scene.docx
+++ b/Unit 10 - Lighting/4- Add light sources to your scene.docx
@@ -208,12 +208,21 @@
       <w:r>
         <w:t xml:space="preserve"> &gt; </w:t>
       </w:r>
-      <w:r>
-        <w:rPr>
-          <w:b/>
-          <w:bCs/>
-        </w:rPr>
-        <w:t xml:space="preserve">CreativeCore_Lighting </w:t>
+      <w:proofErr w:type="spellStart"/>
+      <w:r>
+        <w:rPr>
+          <w:b/>
+          <w:bCs/>
+        </w:rPr>
+        <w:t>CreativeCore_Lighting</w:t>
+      </w:r>
+      <w:proofErr w:type="spellEnd"/>
+      <w:r>
+        <w:rPr>
+          <w:b/>
+          <w:bCs/>
+        </w:rPr>
+        <w:t xml:space="preserve"> </w:t>
       </w:r>
       <w:r>
         <w:t>&gt;</w:t>
@@ -228,6 +237,7 @@
       <w:r>
         <w:t xml:space="preserve"> and open </w:t>
       </w:r>
+      <w:proofErr w:type="spellStart"/>
       <w:r>
         <w:rPr>
           <w:b/>
@@ -242,6 +252,7 @@
         </w:rPr>
         <w:t>Scene_Lighting_Outdoor</w:t>
       </w:r>
+      <w:proofErr w:type="spellEnd"/>
       <w:r>
         <w:t>.</w:t>
       </w:r>
@@ -267,6 +278,7 @@
       <w:r>
         <w:t xml:space="preserve"> &gt; </w:t>
       </w:r>
+      <w:proofErr w:type="spellStart"/>
       <w:r>
         <w:rPr>
           <w:b/>
@@ -274,6 +286,7 @@
         </w:rPr>
         <w:t>CreativeCore_Lighting</w:t>
       </w:r>
+      <w:proofErr w:type="spellEnd"/>
       <w:r>
         <w:t xml:space="preserve"> &gt; </w:t>
       </w:r>
@@ -287,12 +300,21 @@
       <w:r>
         <w:t xml:space="preserve"> and drag in the </w:t>
       </w:r>
-      <w:r>
-        <w:rPr>
-          <w:b/>
-          <w:bCs/>
-        </w:rPr>
-        <w:t>StreetLamp Prefab</w:t>
+      <w:proofErr w:type="spellStart"/>
+      <w:r>
+        <w:rPr>
+          <w:b/>
+          <w:bCs/>
+        </w:rPr>
+        <w:t>StreetLamp</w:t>
+      </w:r>
+      <w:proofErr w:type="spellEnd"/>
+      <w:r>
+        <w:rPr>
+          <w:b/>
+          <w:bCs/>
+        </w:rPr>
+        <w:t xml:space="preserve"> Prefab</w:t>
       </w:r>
       <w:r>
         <w:t xml:space="preserve"> into the Scene view to instantiate it. Position it anywhere you like in the amphitheater.</w:t>
@@ -300,6 +322,9 @@
     </w:p>
     <w:p>
       <w:r>
+        <w:rPr>
+          <w:noProof/>
+        </w:rPr>
         <w:lastRenderedPageBreak/>
         <w:drawing>
           <wp:inline distT="0" distB="0" distL="0" distR="0" wp14:anchorId="7DFF253A" wp14:editId="7DDA207F">
@@ -362,6 +387,7 @@
       <w:r>
         <w:t xml:space="preserve"> In the Hierarchy, expand the parent </w:t>
       </w:r>
+      <w:proofErr w:type="spellStart"/>
       <w:r>
         <w:rPr>
           <w:b/>
@@ -369,8 +395,17 @@
         </w:rPr>
         <w:t>StreetLamp</w:t>
       </w:r>
-      <w:r>
-        <w:t xml:space="preserve"> GameObject and select the </w:t>
+      <w:proofErr w:type="spellEnd"/>
+      <w:r>
+        <w:t xml:space="preserve"> </w:t>
+      </w:r>
+      <w:proofErr w:type="spellStart"/>
+      <w:r>
+        <w:t>GameObject</w:t>
+      </w:r>
+      <w:proofErr w:type="spellEnd"/>
+      <w:r>
+        <w:t xml:space="preserve"> and select the </w:t>
       </w:r>
       <w:r>
         <w:rPr>
@@ -380,7 +415,15 @@
         <w:t>Spot Light</w:t>
       </w:r>
       <w:r>
-        <w:t xml:space="preserve"> GameObject. This is the source of the light for this object that appeared when it was instantiated.</w:t>
+        <w:t xml:space="preserve"> </w:t>
+      </w:r>
+      <w:proofErr w:type="spellStart"/>
+      <w:r>
+        <w:t>GameObject</w:t>
+      </w:r>
+      <w:proofErr w:type="spellEnd"/>
+      <w:r>
+        <w:t>. This is the source of the light for this object that appeared when it was instantiated.</w:t>
       </w:r>
     </w:p>
     <w:p>
@@ -392,7 +435,15 @@
         <w:t>Note:</w:t>
       </w:r>
       <w:r>
-        <w:t xml:space="preserve"> If you were adding a light without using a prop Prefab, you can create a GameObject with a Light component already added via the </w:t>
+        <w:t xml:space="preserve"> If you were adding a light without using a prop Prefab, you can create a </w:t>
+      </w:r>
+      <w:proofErr w:type="spellStart"/>
+      <w:r>
+        <w:t>GameObject</w:t>
+      </w:r>
+      <w:proofErr w:type="spellEnd"/>
+      <w:r>
+        <w:t xml:space="preserve"> with a Light component already added via the </w:t>
       </w:r>
       <w:r>
         <w:rPr>
@@ -412,7 +463,15 @@
         <w:t>+</w:t>
       </w:r>
       <w:r>
-        <w:t>) menu in the Hierarchy. You can also add a Light component to any GameObject.</w:t>
+        <w:t xml:space="preserve">) menu in the Hierarchy. You can also add a Light component to any </w:t>
+      </w:r>
+      <w:proofErr w:type="spellStart"/>
+      <w:r>
+        <w:t>GameObject</w:t>
+      </w:r>
+      <w:proofErr w:type="spellEnd"/>
+      <w:r>
+        <w:t>.</w:t>
       </w:r>
     </w:p>
     <w:p>
@@ -429,6 +488,9 @@
     </w:p>
     <w:p>
       <w:r>
+        <w:rPr>
+          <w:noProof/>
+        </w:rPr>
         <w:drawing>
           <wp:inline distT="0" distB="0" distL="0" distR="0" wp14:anchorId="40442113" wp14:editId="2D07B7D6">
             <wp:extent cx="4610100" cy="3676650"/>
@@ -514,6 +576,9 @@
     </w:p>
     <w:p>
       <w:r>
+        <w:rPr>
+          <w:noProof/>
+        </w:rPr>
         <w:drawing>
           <wp:inline distT="0" distB="0" distL="0" distR="0" wp14:anchorId="10B5AB40" wp14:editId="06D393CF">
             <wp:extent cx="5943600" cy="2772410"/>
@@ -745,6 +810,9 @@
     </w:p>
     <w:p>
       <w:r>
+        <w:rPr>
+          <w:noProof/>
+        </w:rPr>
         <w:lastRenderedPageBreak/>
         <w:drawing>
           <wp:inline distT="0" distB="0" distL="0" distR="0" wp14:anchorId="24776575" wp14:editId="367A2469">
@@ -947,18 +1015,7 @@
         <w:t>Color</w:t>
       </w:r>
       <w:r>
-        <w:t xml:space="preserve"> property box to open the Color picker window and adjust the color of the light. Take a moment to experiment with things that fit with </w:t>
-      </w:r>
-      <w:hyperlink r:id="rId11" w:anchor="619cce83edbc2a39ad08bae0" w:tgtFrame="_self" w:history="1">
-        <w:r>
-          <w:rPr>
-            <w:rStyle w:val="Hyperlink"/>
-          </w:rPr>
-          <w:t>your goals for the outdoor scene</w:t>
-        </w:r>
-      </w:hyperlink>
-      <w:r>
-        <w:t>.</w:t>
+        <w:t xml:space="preserve"> property box to open the Color picker window and adjust the color of the light. </w:t>
       </w:r>
     </w:p>
     <w:p>
@@ -1008,6 +1065,9 @@
     </w:p>
     <w:p>
       <w:r>
+        <w:rPr>
+          <w:noProof/>
+        </w:rPr>
         <w:lastRenderedPageBreak/>
         <w:drawing>
           <wp:inline distT="0" distB="0" distL="0" distR="0" wp14:anchorId="137BFD9E" wp14:editId="49A76929">
@@ -1027,7 +1087,7 @@
                     </pic:cNvPicPr>
                   </pic:nvPicPr>
                   <pic:blipFill>
-                    <a:blip r:embed="rId12" cstate="print">
+                    <a:blip r:embed="rId11" cstate="print">
                       <a:extLst>
                         <a:ext uri="{28A0092B-C50C-407E-A947-70E740481C1C}">
                           <a14:useLocalDpi xmlns:a14="http://schemas.microsoft.com/office/drawing/2010/main" val="0"/>
@@ -1073,30 +1133,14 @@
       <w:r>
         <w:t xml:space="preserve">If you’re interested in exploring this in more detail, you might like to start with the following short article: </w:t>
       </w:r>
-      <w:hyperlink r:id="rId13" w:tgtFrame="_self" w:history="1">
+      <w:hyperlink r:id="rId12" w:tgtFrame="_self" w:history="1">
         <w:r>
           <w:rPr>
             <w:rStyle w:val="Hyperlink"/>
             <w:b/>
             <w:bCs/>
           </w:rPr>
-          <w:t>Why doesn’t a plain, white pie</w:t>
-        </w:r>
-        <w:r>
-          <w:rPr>
-            <w:rStyle w:val="Hyperlink"/>
-            <w:b/>
-            <w:bCs/>
-          </w:rPr>
-          <w:t>c</w:t>
-        </w:r>
-        <w:r>
-          <w:rPr>
-            <w:rStyle w:val="Hyperlink"/>
-            <w:b/>
-            <w:bCs/>
-          </w:rPr>
-          <w:t>e of paper reflect light, but a mirror does?</w:t>
+          <w:t>Why doesn’t a plain, white piece of paper reflect light, but a mirror does?</w:t>
         </w:r>
       </w:hyperlink>
       <w:r>
@@ -1142,7 +1186,7 @@
         </w:rPr>
         <w:t xml:space="preserve">Khan Academy’s </w:t>
       </w:r>
-      <w:hyperlink r:id="rId14" w:tgtFrame="_self" w:history="1">
+      <w:hyperlink r:id="rId13" w:tgtFrame="_self" w:history="1">
         <w:r>
           <w:rPr>
             <w:rStyle w:val="Hyperlink"/>
@@ -1152,7 +1196,7 @@
           <w:t xml:space="preserve">Pixar in a Box </w:t>
         </w:r>
       </w:hyperlink>
-      <w:hyperlink r:id="rId15" w:tgtFrame="_self" w:history="1">
+      <w:hyperlink r:id="rId14" w:tgtFrame="_self" w:history="1">
         <w:r>
           <w:rPr>
             <w:rStyle w:val="Hyperlink"/>
@@ -1185,7 +1229,7 @@
         </w:rPr>
         <w:t xml:space="preserve">Draw Paint Academy’s </w:t>
       </w:r>
-      <w:hyperlink r:id="rId16" w:tgtFrame="_self" w:history="1">
+      <w:hyperlink r:id="rId15" w:tgtFrame="_self" w:history="1">
         <w:r>
           <w:rPr>
             <w:rStyle w:val="Hyperlink"/>
@@ -1220,7 +1264,7 @@
         </w:rPr>
         <w:t xml:space="preserve">Massachusetts College of Art and Design’s </w:t>
       </w:r>
-      <w:hyperlink r:id="rId17" w:tgtFrame="_self" w:history="1">
+      <w:hyperlink r:id="rId16" w:tgtFrame="_self" w:history="1">
         <w:r>
           <w:rPr>
             <w:rStyle w:val="Hyperlink"/>
@@ -1256,7 +1300,7 @@
         <w:lastRenderedPageBreak/>
         <w:t xml:space="preserve">Bill Williams’s Stage Lighting Design on </w:t>
       </w:r>
-      <w:hyperlink r:id="rId18" w:tgtFrame="_self" w:history="1">
+      <w:hyperlink r:id="rId17" w:tgtFrame="_self" w:history="1">
         <w:r>
           <w:rPr>
             <w:rStyle w:val="Hyperlink"/>
@@ -1316,6 +1360,7 @@
       <w:r>
         <w:t>If you’re unsure on prop placement to achieve visible shadows, review the street lamp placement in the outdoor example scene (</w:t>
       </w:r>
+      <w:proofErr w:type="spellStart"/>
       <w:r>
         <w:rPr>
           <w:b/>
@@ -1323,6 +1368,7 @@
         </w:rPr>
         <w:t>FinalScene_Lighting_Outdoor</w:t>
       </w:r>
+      <w:proofErr w:type="spellEnd"/>
       <w:r>
         <w:t>).</w:t>
       </w:r>
@@ -1446,7 +1492,7 @@
       <w:r>
         <w:t xml:space="preserve"> This is a very high level reference to color space. If you’d like to learn more in the context of Unity, </w:t>
       </w:r>
-      <w:hyperlink r:id="rId19" w:tgtFrame="_self" w:history="1">
+      <w:hyperlink r:id="rId18" w:tgtFrame="_self" w:history="1">
         <w:r>
           <w:rPr>
             <w:rStyle w:val="Hyperlink"/>
@@ -1498,12 +1544,21 @@
       <w:r>
         <w:t xml:space="preserve"> &gt; </w:t>
       </w:r>
-      <w:r>
-        <w:rPr>
-          <w:b/>
-          <w:bCs/>
-        </w:rPr>
-        <w:t xml:space="preserve">CreativeCore_Lighting </w:t>
+      <w:proofErr w:type="spellStart"/>
+      <w:r>
+        <w:rPr>
+          <w:b/>
+          <w:bCs/>
+        </w:rPr>
+        <w:t>CreativeCore_Lighting</w:t>
+      </w:r>
+      <w:proofErr w:type="spellEnd"/>
+      <w:r>
+        <w:rPr>
+          <w:b/>
+          <w:bCs/>
+        </w:rPr>
+        <w:t xml:space="preserve"> </w:t>
       </w:r>
       <w:r>
         <w:t>&gt;</w:t>
@@ -1518,6 +1573,7 @@
       <w:r>
         <w:t xml:space="preserve"> and open </w:t>
       </w:r>
+      <w:proofErr w:type="spellStart"/>
       <w:r>
         <w:rPr>
           <w:b/>
@@ -1525,6 +1581,7 @@
         </w:rPr>
         <w:t>FinalScene_Lighting_Outdoor</w:t>
       </w:r>
+      <w:proofErr w:type="spellEnd"/>
       <w:r>
         <w:t xml:space="preserve"> — there’s currently more to see there.</w:t>
       </w:r>
@@ -1679,6 +1736,7 @@
       <w:r>
         <w:t xml:space="preserve"> Open the </w:t>
       </w:r>
+      <w:proofErr w:type="spellStart"/>
       <w:r>
         <w:rPr>
           <w:b/>
@@ -1693,6 +1751,7 @@
         </w:rPr>
         <w:t>Scene_Lighting_Outdoor</w:t>
       </w:r>
+      <w:proofErr w:type="spellEnd"/>
       <w:r>
         <w:t xml:space="preserve"> scene again to continue working there.</w:t>
       </w:r>
@@ -1724,15 +1783,6 @@
           <w:b/>
           <w:bCs/>
         </w:rPr>
-        <w:t>Q&amp;A (0)</w:t>
-      </w:r>
-    </w:p>
-    <w:p>
-      <w:r>
-        <w:rPr>
-          <w:b/>
-          <w:bCs/>
-        </w:rPr>
         <w:t xml:space="preserve">Ambient light </w:t>
       </w:r>
       <w:r>
@@ -1810,6 +1860,9 @@
     </w:p>
     <w:p>
       <w:r>
+        <w:rPr>
+          <w:noProof/>
+        </w:rPr>
         <w:drawing>
           <wp:inline distT="0" distB="0" distL="0" distR="0" wp14:anchorId="16BD4E26" wp14:editId="3BBE5B8E">
             <wp:extent cx="5019675" cy="2076450"/>
@@ -1828,7 +1881,7 @@
                     </pic:cNvPicPr>
                   </pic:nvPicPr>
                   <pic:blipFill>
-                    <a:blip r:embed="rId20">
+                    <a:blip r:embed="rId19">
                       <a:extLst>
                         <a:ext uri="{28A0092B-C50C-407E-A947-70E740481C1C}">
                           <a14:useLocalDpi xmlns:a14="http://schemas.microsoft.com/office/drawing/2010/main" val="0"/>
@@ -1894,6 +1947,9 @@
     </w:p>
     <w:p>
       <w:r>
+        <w:rPr>
+          <w:noProof/>
+        </w:rPr>
         <w:lastRenderedPageBreak/>
         <w:drawing>
           <wp:inline distT="0" distB="0" distL="0" distR="0" wp14:anchorId="776BC0AC" wp14:editId="5EDA3E8B">
@@ -1913,7 +1969,7 @@
                     </pic:cNvPicPr>
                   </pic:nvPicPr>
                   <pic:blipFill>
-                    <a:blip r:embed="rId21">
+                    <a:blip r:embed="rId20">
                       <a:extLst>
                         <a:ext uri="{28A0092B-C50C-407E-A947-70E740481C1C}">
                           <a14:useLocalDpi xmlns:a14="http://schemas.microsoft.com/office/drawing/2010/main" val="0"/>
@@ -2005,8 +2061,13 @@
         </w:rPr>
         <w:t xml:space="preserve">Note: </w:t>
       </w:r>
-      <w:r>
-        <w:t xml:space="preserve">GameObjects need to be flagged as </w:t>
+      <w:proofErr w:type="spellStart"/>
+      <w:r>
+        <w:t>GameObjects</w:t>
+      </w:r>
+      <w:proofErr w:type="spellEnd"/>
+      <w:r>
+        <w:t xml:space="preserve"> need to be flagged as </w:t>
       </w:r>
       <w:r>
         <w:rPr>
@@ -2016,7 +2077,15 @@
         <w:t xml:space="preserve">Static </w:t>
       </w:r>
       <w:r>
-        <w:t xml:space="preserve">to be included in the lightmap for ambient lighting. This is because lightmap data is precalculated and can only be calculated for GameObjects that don’t move at runtime. You’ll learn more about this when you bake lighting for this scene. To see changes as you experiment, press </w:t>
+        <w:t xml:space="preserve">to be included in the lightmap for ambient lighting. This is because lightmap data is precalculated and can only be calculated for </w:t>
+      </w:r>
+      <w:proofErr w:type="spellStart"/>
+      <w:r>
+        <w:t>GameObjects</w:t>
+      </w:r>
+      <w:proofErr w:type="spellEnd"/>
+      <w:r>
+        <w:t xml:space="preserve"> that don’t move at runtime. You’ll learn more about this when you bake lighting for this scene. To see changes as you experiment, press </w:t>
       </w:r>
       <w:r>
         <w:rPr>
@@ -2029,6 +2098,125 @@
         <w:t xml:space="preserve"> at the bottom of your Lighting Tab.</w:t>
       </w:r>
     </w:p>
+    <w:p/>
+    <w:p>
+      <w:r>
+        <w:t xml:space="preserve">Note: </w:t>
+      </w:r>
+      <w:r>
+        <w:t>In modern versions of Unity, scenes do not automatically come with a lighting settings file. If this asset is missing, almost all lighting generation options will be locked.</w:t>
+      </w:r>
+    </w:p>
+    <w:p>
+      <w:pPr>
+        <w:numPr>
+          <w:ilvl w:val="0"/>
+          <w:numId w:val="8"/>
+        </w:numPr>
+      </w:pPr>
+      <w:r>
+        <w:rPr>
+          <w:b/>
+          <w:bCs/>
+        </w:rPr>
+        <w:t>The Fix:</w:t>
+      </w:r>
+    </w:p>
+    <w:p>
+      <w:pPr>
+        <w:numPr>
+          <w:ilvl w:val="1"/>
+          <w:numId w:val="8"/>
+        </w:numPr>
+      </w:pPr>
+      <w:r>
+        <w:t xml:space="preserve">Open the lighting window by navigating to </w:t>
+      </w:r>
+      <w:r>
+        <w:rPr>
+          <w:b/>
+          <w:bCs/>
+        </w:rPr>
+        <w:t>Window</w:t>
+      </w:r>
+      <w:r>
+        <w:t xml:space="preserve"> → </w:t>
+      </w:r>
+      <w:r>
+        <w:rPr>
+          <w:b/>
+          <w:bCs/>
+        </w:rPr>
+        <w:t>Rendering</w:t>
+      </w:r>
+      <w:r>
+        <w:t xml:space="preserve"> → </w:t>
+      </w:r>
+      <w:r>
+        <w:rPr>
+          <w:b/>
+          <w:bCs/>
+        </w:rPr>
+        <w:t>Lighting</w:t>
+      </w:r>
+      <w:r>
+        <w:t>.</w:t>
+      </w:r>
+    </w:p>
+    <w:p>
+      <w:pPr>
+        <w:numPr>
+          <w:ilvl w:val="1"/>
+          <w:numId w:val="8"/>
+        </w:numPr>
+      </w:pPr>
+      <w:r>
+        <w:t xml:space="preserve">Select the </w:t>
+      </w:r>
+      <w:r>
+        <w:rPr>
+          <w:b/>
+          <w:bCs/>
+        </w:rPr>
+        <w:t>Scene</w:t>
+      </w:r>
+      <w:r>
+        <w:t xml:space="preserve"> tab at the top.</w:t>
+      </w:r>
+    </w:p>
+    <w:p>
+      <w:pPr>
+        <w:numPr>
+          <w:ilvl w:val="1"/>
+          <w:numId w:val="8"/>
+        </w:numPr>
+      </w:pPr>
+      <w:r>
+        <w:t xml:space="preserve">Look at the very top of the panel for a button that says </w:t>
+      </w:r>
+      <w:r>
+        <w:rPr>
+          <w:b/>
+          <w:bCs/>
+        </w:rPr>
+        <w:t>New Lighting Settings</w:t>
+      </w:r>
+      <w:r>
+        <w:t xml:space="preserve"> (or a similar prompt) and click it.</w:t>
+      </w:r>
+    </w:p>
+    <w:p>
+      <w:pPr>
+        <w:numPr>
+          <w:ilvl w:val="1"/>
+          <w:numId w:val="8"/>
+        </w:numPr>
+      </w:pPr>
+      <w:r>
+        <w:t xml:space="preserve">This creates a dedicated settings asset for your scene, which instantly enables the lighting generation buttons. </w:t>
+      </w:r>
+    </w:p>
+    <w:p/>
     <w:p>
       <w:r>
         <w:rPr>
@@ -2097,6 +2285,7 @@
           <w:b/>
           <w:bCs/>
         </w:rPr>
+        <w:lastRenderedPageBreak/>
         <w:t>6.</w:t>
       </w:r>
       <w:r>
@@ -2136,11 +2325,6 @@
       </w:r>
     </w:p>
     <w:p>
-      <w:r>
-        <w:t>Mark step incomplete</w:t>
-      </w:r>
-    </w:p>
-    <w:p>
       <w:pPr>
         <w:rPr>
           <w:b/>
@@ -2153,15 +2337,6 @@
           <w:bCs/>
         </w:rPr>
         <w:t>8. Next steps</w:t>
-      </w:r>
-    </w:p>
-    <w:p>
-      <w:r>
-        <w:rPr>
-          <w:b/>
-          <w:bCs/>
-        </w:rPr>
-        <w:t>Q&amp;A (0)</w:t>
       </w:r>
     </w:p>
     <w:p>
@@ -2928,6 +3103,151 @@
     </w:lvl>
   </w:abstractNum>
   <w:abstractNum w:abstractNumId="5" w15:restartNumberingAfterBreak="0">
+    <w:nsid w:val="6A934805"/>
+    <w:multiLevelType w:val="multilevel"/>
+    <w:tmpl w:val="3F3A2106"/>
+    <w:lvl w:ilvl="0">
+      <w:start w:val="1"/>
+      <w:numFmt w:val="bullet"/>
+      <w:lvlText w:val=""/>
+      <w:lvlJc w:val="left"/>
+      <w:pPr>
+        <w:tabs>
+          <w:tab w:val="num" w:pos="720"/>
+        </w:tabs>
+        <w:ind w:left="720" w:hanging="360"/>
+      </w:pPr>
+      <w:rPr>
+        <w:rFonts w:ascii="Symbol" w:hAnsi="Symbol" w:hint="default"/>
+        <w:sz w:val="20"/>
+      </w:rPr>
+    </w:lvl>
+    <w:lvl w:ilvl="1">
+      <w:start w:val="1"/>
+      <w:numFmt w:val="decimal"/>
+      <w:lvlText w:val="%2."/>
+      <w:lvlJc w:val="left"/>
+      <w:pPr>
+        <w:tabs>
+          <w:tab w:val="num" w:pos="1440"/>
+        </w:tabs>
+        <w:ind w:left="1440" w:hanging="360"/>
+      </w:pPr>
+    </w:lvl>
+    <w:lvl w:ilvl="2" w:tentative="1">
+      <w:start w:val="1"/>
+      <w:numFmt w:val="bullet"/>
+      <w:lvlText w:val=""/>
+      <w:lvlJc w:val="left"/>
+      <w:pPr>
+        <w:tabs>
+          <w:tab w:val="num" w:pos="2160"/>
+        </w:tabs>
+        <w:ind w:left="2160" w:hanging="360"/>
+      </w:pPr>
+      <w:rPr>
+        <w:rFonts w:ascii="Wingdings" w:hAnsi="Wingdings" w:hint="default"/>
+        <w:sz w:val="20"/>
+      </w:rPr>
+    </w:lvl>
+    <w:lvl w:ilvl="3" w:tentative="1">
+      <w:start w:val="1"/>
+      <w:numFmt w:val="bullet"/>
+      <w:lvlText w:val=""/>
+      <w:lvlJc w:val="left"/>
+      <w:pPr>
+        <w:tabs>
+          <w:tab w:val="num" w:pos="2880"/>
+        </w:tabs>
+        <w:ind w:left="2880" w:hanging="360"/>
+      </w:pPr>
+      <w:rPr>
+        <w:rFonts w:ascii="Wingdings" w:hAnsi="Wingdings" w:hint="default"/>
+        <w:sz w:val="20"/>
+      </w:rPr>
+    </w:lvl>
+    <w:lvl w:ilvl="4" w:tentative="1">
+      <w:start w:val="1"/>
+      <w:numFmt w:val="bullet"/>
+      <w:lvlText w:val=""/>
+      <w:lvlJc w:val="left"/>
+      <w:pPr>
+        <w:tabs>
+          <w:tab w:val="num" w:pos="3600"/>
+        </w:tabs>
+        <w:ind w:left="3600" w:hanging="360"/>
+      </w:pPr>
+      <w:rPr>
+        <w:rFonts w:ascii="Wingdings" w:hAnsi="Wingdings" w:hint="default"/>
+        <w:sz w:val="20"/>
+      </w:rPr>
+    </w:lvl>
+    <w:lvl w:ilvl="5" w:tentative="1">
+      <w:start w:val="1"/>
+      <w:numFmt w:val="bullet"/>
+      <w:lvlText w:val=""/>
+      <w:lvlJc w:val="left"/>
+      <w:pPr>
+        <w:tabs>
+          <w:tab w:val="num" w:pos="4320"/>
+        </w:tabs>
+        <w:ind w:left="4320" w:hanging="360"/>
+      </w:pPr>
+      <w:rPr>
+        <w:rFonts w:ascii="Wingdings" w:hAnsi="Wingdings" w:hint="default"/>
+        <w:sz w:val="20"/>
+      </w:rPr>
+    </w:lvl>
+    <w:lvl w:ilvl="6" w:tentative="1">
+      <w:start w:val="1"/>
+      <w:numFmt w:val="bullet"/>
+      <w:lvlText w:val=""/>
+      <w:lvlJc w:val="left"/>
+      <w:pPr>
+        <w:tabs>
+          <w:tab w:val="num" w:pos="5040"/>
+        </w:tabs>
+        <w:ind w:left="5040" w:hanging="360"/>
+      </w:pPr>
+      <w:rPr>
+        <w:rFonts w:ascii="Wingdings" w:hAnsi="Wingdings" w:hint="default"/>
+        <w:sz w:val="20"/>
+      </w:rPr>
+    </w:lvl>
+    <w:lvl w:ilvl="7" w:tentative="1">
+      <w:start w:val="1"/>
+      <w:numFmt w:val="bullet"/>
+      <w:lvlText w:val=""/>
+      <w:lvlJc w:val="left"/>
+      <w:pPr>
+        <w:tabs>
+          <w:tab w:val="num" w:pos="5760"/>
+        </w:tabs>
+        <w:ind w:left="5760" w:hanging="360"/>
+      </w:pPr>
+      <w:rPr>
+        <w:rFonts w:ascii="Wingdings" w:hAnsi="Wingdings" w:hint="default"/>
+        <w:sz w:val="20"/>
+      </w:rPr>
+    </w:lvl>
+    <w:lvl w:ilvl="8" w:tentative="1">
+      <w:start w:val="1"/>
+      <w:numFmt w:val="bullet"/>
+      <w:lvlText w:val=""/>
+      <w:lvlJc w:val="left"/>
+      <w:pPr>
+        <w:tabs>
+          <w:tab w:val="num" w:pos="6480"/>
+        </w:tabs>
+        <w:ind w:left="6480" w:hanging="360"/>
+      </w:pPr>
+      <w:rPr>
+        <w:rFonts w:ascii="Wingdings" w:hAnsi="Wingdings" w:hint="default"/>
+        <w:sz w:val="20"/>
+      </w:rPr>
+    </w:lvl>
+  </w:abstractNum>
+  <w:abstractNum w:abstractNumId="6" w15:restartNumberingAfterBreak="0">
     <w:nsid w:val="72893E59"/>
     <w:multiLevelType w:val="multilevel"/>
     <w:tmpl w:val="5D224FE4"/>
@@ -3076,7 +3396,7 @@
       </w:rPr>
     </w:lvl>
   </w:abstractNum>
-  <w:abstractNum w:abstractNumId="6" w15:restartNumberingAfterBreak="0">
+  <w:abstractNum w:abstractNumId="7" w15:restartNumberingAfterBreak="0">
     <w:nsid w:val="78260DDB"/>
     <w:multiLevelType w:val="multilevel"/>
     <w:tmpl w:val="895051E0"/>
@@ -3226,13 +3546,13 @@
     </w:lvl>
   </w:abstractNum>
   <w:num w:numId="1" w16cid:durableId="1009060306">
-    <w:abstractNumId w:val="6"/>
+    <w:abstractNumId w:val="7"/>
   </w:num>
   <w:num w:numId="2" w16cid:durableId="1815903006">
     <w:abstractNumId w:val="4"/>
   </w:num>
   <w:num w:numId="3" w16cid:durableId="944188538">
-    <w:abstractNumId w:val="5"/>
+    <w:abstractNumId w:val="6"/>
   </w:num>
   <w:num w:numId="4" w16cid:durableId="622734812">
     <w:abstractNumId w:val="0"/>
@@ -3245,6 +3565,9 @@
   </w:num>
   <w:num w:numId="7" w16cid:durableId="553732574">
     <w:abstractNumId w:val="3"/>
+  </w:num>
+  <w:num w:numId="8" w16cid:durableId="652569545">
+    <w:abstractNumId w:val="5"/>
   </w:num>
 </w:numbering>
 </file>

</xml_diff>